<commit_message>
Adding ImageType sensitivity analysis
</commit_message>
<xml_diff>
--- a/detection_mode_project/outputs/figures/supplement/supplementary_table_1.docx
+++ b/detection_mode_project/outputs/figures/supplement/supplementary_table_1.docx
@@ -22,7 +22,6 @@
           <w:trHeight w:val="571" w:hRule="auto"/>
           <w:tblHeader/>
         </w:trPr>
-        header1
         <w:tc>
           <w:tcPr>
             <w:tcBorders>
@@ -52,6 +51,16 @@
               </w:pBdr>
               <w:spacing w:after="0" w:before="0" w:line="240"/>
               <w:ind w:left="100" w:right="100" w:firstLine="0" w:firstLineChars="0"/>
+              <w:rPr>
+                <w:rFonts w:ascii="Arial" w:hAnsi="Arial" w:eastAsia="Arial" w:cs="Arial"/>
+                <w:i w:val="false"/>
+                <w:b w:val="false"/>
+                <w:u w:val="none"/>
+                <w:strike w:val="false"/>
+                <w:sz w:val="16"/>
+                <w:szCs w:val="16"/>
+                <w:color w:val="000000"/>
+              </w:rPr>
             </w:pPr>
             <w:r>
               <w:rPr>
@@ -59,6 +68,7 @@
                 <w:i w:val="false"/>
                 <w:b w:val="false"/>
                 <w:u w:val="none"/>
+                <w:strike w:val="false"/>
                 <w:sz w:val="16"/>
                 <w:szCs w:val="16"/>
                 <w:color w:val="000000"/>
@@ -97,6 +107,16 @@
               </w:pBdr>
               <w:spacing w:after="0" w:before="0" w:line="240"/>
               <w:ind w:left="100" w:right="100" w:firstLine="0" w:firstLineChars="0"/>
+              <w:rPr>
+                <w:rFonts w:ascii="Arial" w:hAnsi="Arial" w:eastAsia="Arial" w:cs="Arial"/>
+                <w:i w:val="false"/>
+                <w:b w:val="false"/>
+                <w:u w:val="none"/>
+                <w:strike w:val="false"/>
+                <w:sz w:val="16"/>
+                <w:szCs w:val="16"/>
+                <w:color w:val="000000"/>
+              </w:rPr>
             </w:pPr>
             <w:r>
               <w:rPr>
@@ -104,6 +124,7 @@
                 <w:i w:val="false"/>
                 <w:b w:val="true"/>
                 <w:u w:val="none"/>
+                <w:strike w:val="false"/>
                 <w:sz w:val="16"/>
                 <w:szCs w:val="16"/>
                 <w:color w:val="000000"/>
@@ -118,7 +139,6 @@
           <w:trHeight w:val="614" w:hRule="auto"/>
           <w:tblHeader/>
         </w:trPr>
-        header2
         <w:tc>
           <w:tcPr>
             <w:tcBorders>
@@ -148,6 +168,16 @@
               </w:pBdr>
               <w:spacing w:after="0" w:before="0" w:line="240"/>
               <w:ind w:left="100" w:right="100" w:firstLine="0" w:firstLineChars="0"/>
+              <w:rPr>
+                <w:rFonts w:ascii="Arial" w:hAnsi="Arial" w:eastAsia="Arial" w:cs="Arial"/>
+                <w:i w:val="false"/>
+                <w:b w:val="false"/>
+                <w:u w:val="none"/>
+                <w:strike w:val="false"/>
+                <w:sz w:val="16"/>
+                <w:szCs w:val="16"/>
+                <w:color w:val="000000"/>
+              </w:rPr>
             </w:pPr>
             <w:r>
               <w:rPr>
@@ -155,6 +185,7 @@
                 <w:i w:val="false"/>
                 <w:b w:val="true"/>
                 <w:u w:val="none"/>
+                <w:strike w:val="false"/>
                 <w:sz w:val="16"/>
                 <w:szCs w:val="16"/>
                 <w:color w:val="000000"/>
@@ -192,6 +223,16 @@
               </w:pBdr>
               <w:spacing w:after="0" w:before="0" w:line="240"/>
               <w:ind w:left="100" w:right="100" w:firstLine="0" w:firstLineChars="0"/>
+              <w:rPr>
+                <w:rFonts w:ascii="Arial" w:hAnsi="Arial" w:eastAsia="Arial" w:cs="Arial"/>
+                <w:i w:val="false"/>
+                <w:b w:val="false"/>
+                <w:u w:val="none"/>
+                <w:strike w:val="false"/>
+                <w:sz w:val="16"/>
+                <w:szCs w:val="16"/>
+                <w:color w:val="000000"/>
+              </w:rPr>
             </w:pPr>
             <w:r>
               <w:rPr>
@@ -199,6 +240,7 @@
                 <w:i w:val="false"/>
                 <w:b w:val="false"/>
                 <w:u w:val="none"/>
+                <w:strike w:val="false"/>
                 <w:sz w:val="16"/>
                 <w:szCs w:val="16"/>
                 <w:color w:val="000000"/>
@@ -236,6 +278,16 @@
               </w:pBdr>
               <w:spacing w:after="0" w:before="0" w:line="240"/>
               <w:ind w:left="100" w:right="100" w:firstLine="0" w:firstLineChars="0"/>
+              <w:rPr>
+                <w:rFonts w:ascii="Arial" w:hAnsi="Arial" w:eastAsia="Arial" w:cs="Arial"/>
+                <w:i w:val="false"/>
+                <w:b w:val="false"/>
+                <w:u w:val="none"/>
+                <w:strike w:val="false"/>
+                <w:sz w:val="16"/>
+                <w:szCs w:val="16"/>
+                <w:color w:val="000000"/>
+              </w:rPr>
             </w:pPr>
             <w:r>
               <w:rPr>
@@ -243,6 +295,7 @@
                 <w:i w:val="false"/>
                 <w:b w:val="false"/>
                 <w:u w:val="none"/>
+                <w:strike w:val="false"/>
                 <w:sz w:val="16"/>
                 <w:szCs w:val="16"/>
                 <w:color w:val="000000"/>
@@ -280,6 +333,16 @@
               </w:pBdr>
               <w:spacing w:after="0" w:before="0" w:line="240"/>
               <w:ind w:left="100" w:right="100" w:firstLine="0" w:firstLineChars="0"/>
+              <w:rPr>
+                <w:rFonts w:ascii="Arial" w:hAnsi="Arial" w:eastAsia="Arial" w:cs="Arial"/>
+                <w:i w:val="false"/>
+                <w:b w:val="false"/>
+                <w:u w:val="none"/>
+                <w:strike w:val="false"/>
+                <w:sz w:val="16"/>
+                <w:szCs w:val="16"/>
+                <w:color w:val="000000"/>
+              </w:rPr>
             </w:pPr>
             <w:r>
               <w:rPr>
@@ -287,6 +350,7 @@
                 <w:i w:val="false"/>
                 <w:b w:val="false"/>
                 <w:u w:val="none"/>
+                <w:strike w:val="false"/>
                 <w:sz w:val="16"/>
                 <w:szCs w:val="16"/>
                 <w:color w:val="000000"/>
@@ -324,6 +388,16 @@
               </w:pBdr>
               <w:spacing w:after="0" w:before="0" w:line="240"/>
               <w:ind w:left="100" w:right="100" w:firstLine="0" w:firstLineChars="0"/>
+              <w:rPr>
+                <w:rFonts w:ascii="Arial" w:hAnsi="Arial" w:eastAsia="Arial" w:cs="Arial"/>
+                <w:i w:val="false"/>
+                <w:b w:val="false"/>
+                <w:u w:val="none"/>
+                <w:strike w:val="false"/>
+                <w:sz w:val="16"/>
+                <w:szCs w:val="16"/>
+                <w:color w:val="000000"/>
+              </w:rPr>
             </w:pPr>
             <w:r>
               <w:rPr>
@@ -331,6 +405,7 @@
                 <w:i w:val="false"/>
                 <w:b w:val="true"/>
                 <w:u w:val="none"/>
+                <w:strike w:val="false"/>
                 <w:sz w:val="16"/>
                 <w:szCs w:val="16"/>
                 <w:color w:val="000000"/>
@@ -344,7 +419,6 @@
         <w:trPr>
           <w:trHeight w:val="617" w:hRule="auto"/>
         </w:trPr>
-        body1
         <w:tc>
           <w:tcPr>
             <w:tcBorders>
@@ -374,6 +448,16 @@
               </w:pBdr>
               <w:spacing w:after="0" w:before="0" w:line="240"/>
               <w:ind w:left="300" w:right="100" w:firstLine="0" w:firstLineChars="0"/>
+              <w:rPr>
+                <w:rFonts w:ascii="Arial" w:hAnsi="Arial" w:eastAsia="Arial" w:cs="Arial"/>
+                <w:i w:val="false"/>
+                <w:b w:val="false"/>
+                <w:u w:val="none"/>
+                <w:strike w:val="false"/>
+                <w:sz w:val="16"/>
+                <w:szCs w:val="16"/>
+                <w:color w:val="000000"/>
+              </w:rPr>
             </w:pPr>
             <w:r>
               <w:rPr>
@@ -381,6 +465,7 @@
                 <w:i w:val="false"/>
                 <w:b w:val="false"/>
                 <w:u w:val="none"/>
+                <w:strike w:val="false"/>
                 <w:sz w:val="16"/>
                 <w:szCs w:val="16"/>
                 <w:color w:val="000000"/>
@@ -418,6 +503,16 @@
               </w:pBdr>
               <w:spacing w:after="0" w:before="0" w:line="240"/>
               <w:ind w:left="100" w:right="100" w:firstLine="0" w:firstLineChars="0"/>
+              <w:rPr>
+                <w:rFonts w:ascii="Arial" w:hAnsi="Arial" w:eastAsia="Arial" w:cs="Arial"/>
+                <w:i w:val="false"/>
+                <w:b w:val="false"/>
+                <w:u w:val="none"/>
+                <w:strike w:val="false"/>
+                <w:sz w:val="16"/>
+                <w:szCs w:val="16"/>
+                <w:color w:val="000000"/>
+              </w:rPr>
             </w:pPr>
             <w:r>
               <w:rPr>
@@ -425,6 +520,7 @@
                 <w:i w:val="false"/>
                 <w:b w:val="false"/>
                 <w:u w:val="none"/>
+                <w:strike w:val="false"/>
                 <w:sz w:val="16"/>
                 <w:szCs w:val="16"/>
                 <w:color w:val="000000"/>
@@ -462,6 +558,16 @@
               </w:pBdr>
               <w:spacing w:after="0" w:before="0" w:line="240"/>
               <w:ind w:left="100" w:right="100" w:firstLine="0" w:firstLineChars="0"/>
+              <w:rPr>
+                <w:rFonts w:ascii="Arial" w:hAnsi="Arial" w:eastAsia="Arial" w:cs="Arial"/>
+                <w:i w:val="false"/>
+                <w:b w:val="false"/>
+                <w:u w:val="none"/>
+                <w:strike w:val="false"/>
+                <w:sz w:val="16"/>
+                <w:szCs w:val="16"/>
+                <w:color w:val="000000"/>
+              </w:rPr>
             </w:pPr>
             <w:r>
               <w:rPr>
@@ -469,6 +575,7 @@
                 <w:i w:val="false"/>
                 <w:b w:val="false"/>
                 <w:u w:val="none"/>
+                <w:strike w:val="false"/>
                 <w:sz w:val="16"/>
                 <w:szCs w:val="16"/>
                 <w:color w:val="000000"/>
@@ -506,6 +613,16 @@
               </w:pBdr>
               <w:spacing w:after="0" w:before="0" w:line="240"/>
               <w:ind w:left="100" w:right="100" w:firstLine="0" w:firstLineChars="0"/>
+              <w:rPr>
+                <w:rFonts w:ascii="Arial" w:hAnsi="Arial" w:eastAsia="Arial" w:cs="Arial"/>
+                <w:i w:val="false"/>
+                <w:b w:val="false"/>
+                <w:u w:val="none"/>
+                <w:strike w:val="false"/>
+                <w:sz w:val="16"/>
+                <w:szCs w:val="16"/>
+                <w:color w:val="000000"/>
+              </w:rPr>
             </w:pPr>
             <w:r>
               <w:rPr>
@@ -513,6 +630,7 @@
                 <w:i w:val="false"/>
                 <w:b w:val="false"/>
                 <w:u w:val="none"/>
+                <w:strike w:val="false"/>
                 <w:sz w:val="16"/>
                 <w:szCs w:val="16"/>
                 <w:color w:val="000000"/>
@@ -550,6 +668,16 @@
               </w:pBdr>
               <w:spacing w:after="0" w:before="0" w:line="240"/>
               <w:ind w:left="100" w:right="100" w:firstLine="0" w:firstLineChars="0"/>
+              <w:rPr>
+                <w:rFonts w:ascii="Arial" w:hAnsi="Arial" w:eastAsia="Arial" w:cs="Arial"/>
+                <w:i w:val="false"/>
+                <w:b w:val="false"/>
+                <w:u w:val="none"/>
+                <w:strike w:val="false"/>
+                <w:sz w:val="16"/>
+                <w:szCs w:val="16"/>
+                <w:color w:val="000000"/>
+              </w:rPr>
             </w:pPr>
             <w:r>
               <w:rPr>
@@ -557,6 +685,7 @@
                 <w:i w:val="false"/>
                 <w:b w:val="false"/>
                 <w:u w:val="none"/>
+                <w:strike w:val="false"/>
                 <w:sz w:val="16"/>
                 <w:szCs w:val="16"/>
                 <w:color w:val="000000"/>
@@ -570,7 +699,6 @@
         <w:trPr>
           <w:trHeight w:val="617" w:hRule="auto"/>
         </w:trPr>
-        body2
         <w:tc>
           <w:tcPr>
             <w:tcBorders>
@@ -600,6 +728,16 @@
               </w:pBdr>
               <w:spacing w:after="0" w:before="0" w:line="240"/>
               <w:ind w:left="300" w:right="100" w:firstLine="0" w:firstLineChars="0"/>
+              <w:rPr>
+                <w:rFonts w:ascii="Arial" w:hAnsi="Arial" w:eastAsia="Arial" w:cs="Arial"/>
+                <w:i w:val="false"/>
+                <w:b w:val="false"/>
+                <w:u w:val="none"/>
+                <w:strike w:val="false"/>
+                <w:sz w:val="16"/>
+                <w:szCs w:val="16"/>
+                <w:color w:val="000000"/>
+              </w:rPr>
             </w:pPr>
             <w:r>
               <w:rPr>
@@ -607,6 +745,7 @@
                 <w:i w:val="false"/>
                 <w:b w:val="false"/>
                 <w:u w:val="none"/>
+                <w:strike w:val="false"/>
                 <w:sz w:val="16"/>
                 <w:szCs w:val="16"/>
                 <w:color w:val="000000"/>
@@ -644,6 +783,16 @@
               </w:pBdr>
               <w:spacing w:after="0" w:before="0" w:line="240"/>
               <w:ind w:left="100" w:right="100" w:firstLine="0" w:firstLineChars="0"/>
+              <w:rPr>
+                <w:rFonts w:ascii="Arial" w:hAnsi="Arial" w:eastAsia="Arial" w:cs="Arial"/>
+                <w:i w:val="false"/>
+                <w:b w:val="false"/>
+                <w:u w:val="none"/>
+                <w:strike w:val="false"/>
+                <w:sz w:val="16"/>
+                <w:szCs w:val="16"/>
+                <w:color w:val="000000"/>
+              </w:rPr>
             </w:pPr>
             <w:r>
               <w:rPr>
@@ -651,6 +800,7 @@
                 <w:i w:val="false"/>
                 <w:b w:val="false"/>
                 <w:u w:val="none"/>
+                <w:strike w:val="false"/>
                 <w:sz w:val="16"/>
                 <w:szCs w:val="16"/>
                 <w:color w:val="000000"/>
@@ -688,6 +838,16 @@
               </w:pBdr>
               <w:spacing w:after="0" w:before="0" w:line="240"/>
               <w:ind w:left="100" w:right="100" w:firstLine="0" w:firstLineChars="0"/>
+              <w:rPr>
+                <w:rFonts w:ascii="Arial" w:hAnsi="Arial" w:eastAsia="Arial" w:cs="Arial"/>
+                <w:i w:val="false"/>
+                <w:b w:val="false"/>
+                <w:u w:val="none"/>
+                <w:strike w:val="false"/>
+                <w:sz w:val="16"/>
+                <w:szCs w:val="16"/>
+                <w:color w:val="000000"/>
+              </w:rPr>
             </w:pPr>
             <w:r>
               <w:rPr>
@@ -695,6 +855,7 @@
                 <w:i w:val="false"/>
                 <w:b w:val="false"/>
                 <w:u w:val="none"/>
+                <w:strike w:val="false"/>
                 <w:sz w:val="16"/>
                 <w:szCs w:val="16"/>
                 <w:color w:val="000000"/>
@@ -732,6 +893,16 @@
               </w:pBdr>
               <w:spacing w:after="0" w:before="0" w:line="240"/>
               <w:ind w:left="100" w:right="100" w:firstLine="0" w:firstLineChars="0"/>
+              <w:rPr>
+                <w:rFonts w:ascii="Arial" w:hAnsi="Arial" w:eastAsia="Arial" w:cs="Arial"/>
+                <w:i w:val="false"/>
+                <w:b w:val="false"/>
+                <w:u w:val="none"/>
+                <w:strike w:val="false"/>
+                <w:sz w:val="16"/>
+                <w:szCs w:val="16"/>
+                <w:color w:val="000000"/>
+              </w:rPr>
             </w:pPr>
             <w:r>
               <w:rPr>
@@ -739,6 +910,7 @@
                 <w:i w:val="false"/>
                 <w:b w:val="false"/>
                 <w:u w:val="none"/>
+                <w:strike w:val="false"/>
                 <w:sz w:val="16"/>
                 <w:szCs w:val="16"/>
                 <w:color w:val="000000"/>
@@ -776,6 +948,16 @@
               </w:pBdr>
               <w:spacing w:after="0" w:before="0" w:line="240"/>
               <w:ind w:left="100" w:right="100" w:firstLine="0" w:firstLineChars="0"/>
+              <w:rPr>
+                <w:rFonts w:ascii="Arial" w:hAnsi="Arial" w:eastAsia="Arial" w:cs="Arial"/>
+                <w:i w:val="false"/>
+                <w:b w:val="false"/>
+                <w:u w:val="none"/>
+                <w:strike w:val="false"/>
+                <w:sz w:val="16"/>
+                <w:szCs w:val="16"/>
+                <w:color w:val="000000"/>
+              </w:rPr>
             </w:pPr>
             <w:r>
               <w:rPr>
@@ -783,6 +965,7 @@
                 <w:i w:val="false"/>
                 <w:b w:val="false"/>
                 <w:u w:val="none"/>
+                <w:strike w:val="false"/>
                 <w:sz w:val="16"/>
                 <w:szCs w:val="16"/>
                 <w:color w:val="000000"/>
@@ -796,7 +979,6 @@
         <w:trPr>
           <w:trHeight w:val="617" w:hRule="auto"/>
         </w:trPr>
-        body3
         <w:tc>
           <w:tcPr>
             <w:tcBorders>
@@ -826,6 +1008,16 @@
               </w:pBdr>
               <w:spacing w:after="0" w:before="0" w:line="240"/>
               <w:ind w:left="300" w:right="100" w:firstLine="0" w:firstLineChars="0"/>
+              <w:rPr>
+                <w:rFonts w:ascii="Arial" w:hAnsi="Arial" w:eastAsia="Arial" w:cs="Arial"/>
+                <w:i w:val="false"/>
+                <w:b w:val="false"/>
+                <w:u w:val="none"/>
+                <w:strike w:val="false"/>
+                <w:sz w:val="16"/>
+                <w:szCs w:val="16"/>
+                <w:color w:val="000000"/>
+              </w:rPr>
             </w:pPr>
             <w:r>
               <w:rPr>
@@ -833,6 +1025,7 @@
                 <w:i w:val="false"/>
                 <w:b w:val="false"/>
                 <w:u w:val="none"/>
+                <w:strike w:val="false"/>
                 <w:sz w:val="16"/>
                 <w:szCs w:val="16"/>
                 <w:color w:val="000000"/>
@@ -870,6 +1063,16 @@
               </w:pBdr>
               <w:spacing w:after="0" w:before="0" w:line="240"/>
               <w:ind w:left="100" w:right="100" w:firstLine="0" w:firstLineChars="0"/>
+              <w:rPr>
+                <w:rFonts w:ascii="Arial" w:hAnsi="Arial" w:eastAsia="Arial" w:cs="Arial"/>
+                <w:i w:val="false"/>
+                <w:b w:val="false"/>
+                <w:u w:val="none"/>
+                <w:strike w:val="false"/>
+                <w:sz w:val="16"/>
+                <w:szCs w:val="16"/>
+                <w:color w:val="000000"/>
+              </w:rPr>
             </w:pPr>
             <w:r>
               <w:rPr>
@@ -877,6 +1080,7 @@
                 <w:i w:val="false"/>
                 <w:b w:val="false"/>
                 <w:u w:val="none"/>
+                <w:strike w:val="false"/>
                 <w:sz w:val="16"/>
                 <w:szCs w:val="16"/>
                 <w:color w:val="000000"/>
@@ -914,6 +1118,16 @@
               </w:pBdr>
               <w:spacing w:after="0" w:before="0" w:line="240"/>
               <w:ind w:left="100" w:right="100" w:firstLine="0" w:firstLineChars="0"/>
+              <w:rPr>
+                <w:rFonts w:ascii="Arial" w:hAnsi="Arial" w:eastAsia="Arial" w:cs="Arial"/>
+                <w:i w:val="false"/>
+                <w:b w:val="false"/>
+                <w:u w:val="none"/>
+                <w:strike w:val="false"/>
+                <w:sz w:val="16"/>
+                <w:szCs w:val="16"/>
+                <w:color w:val="000000"/>
+              </w:rPr>
             </w:pPr>
             <w:r>
               <w:rPr>
@@ -921,6 +1135,7 @@
                 <w:i w:val="false"/>
                 <w:b w:val="false"/>
                 <w:u w:val="none"/>
+                <w:strike w:val="false"/>
                 <w:sz w:val="16"/>
                 <w:szCs w:val="16"/>
                 <w:color w:val="000000"/>
@@ -958,6 +1173,16 @@
               </w:pBdr>
               <w:spacing w:after="0" w:before="0" w:line="240"/>
               <w:ind w:left="100" w:right="100" w:firstLine="0" w:firstLineChars="0"/>
+              <w:rPr>
+                <w:rFonts w:ascii="Arial" w:hAnsi="Arial" w:eastAsia="Arial" w:cs="Arial"/>
+                <w:i w:val="false"/>
+                <w:b w:val="false"/>
+                <w:u w:val="none"/>
+                <w:strike w:val="false"/>
+                <w:sz w:val="16"/>
+                <w:szCs w:val="16"/>
+                <w:color w:val="000000"/>
+              </w:rPr>
             </w:pPr>
             <w:r>
               <w:rPr>
@@ -965,6 +1190,7 @@
                 <w:i w:val="false"/>
                 <w:b w:val="false"/>
                 <w:u w:val="none"/>
+                <w:strike w:val="false"/>
                 <w:sz w:val="16"/>
                 <w:szCs w:val="16"/>
                 <w:color w:val="000000"/>
@@ -1002,6 +1228,16 @@
               </w:pBdr>
               <w:spacing w:after="0" w:before="0" w:line="240"/>
               <w:ind w:left="100" w:right="100" w:firstLine="0" w:firstLineChars="0"/>
+              <w:rPr>
+                <w:rFonts w:ascii="Arial" w:hAnsi="Arial" w:eastAsia="Arial" w:cs="Arial"/>
+                <w:i w:val="false"/>
+                <w:b w:val="false"/>
+                <w:u w:val="none"/>
+                <w:strike w:val="false"/>
+                <w:sz w:val="16"/>
+                <w:szCs w:val="16"/>
+                <w:color w:val="000000"/>
+              </w:rPr>
             </w:pPr>
             <w:r>
               <w:rPr>
@@ -1009,6 +1245,7 @@
                 <w:i w:val="false"/>
                 <w:b w:val="false"/>
                 <w:u w:val="none"/>
+                <w:strike w:val="false"/>
                 <w:sz w:val="16"/>
                 <w:szCs w:val="16"/>
                 <w:color w:val="000000"/>
@@ -1022,7 +1259,6 @@
         <w:trPr>
           <w:trHeight w:val="617" w:hRule="auto"/>
         </w:trPr>
-        body4
         <w:tc>
           <w:tcPr>
             <w:tcBorders>
@@ -1052,6 +1288,16 @@
               </w:pBdr>
               <w:spacing w:after="0" w:before="0" w:line="240"/>
               <w:ind w:left="300" w:right="100" w:firstLine="0" w:firstLineChars="0"/>
+              <w:rPr>
+                <w:rFonts w:ascii="Arial" w:hAnsi="Arial" w:eastAsia="Arial" w:cs="Arial"/>
+                <w:i w:val="false"/>
+                <w:b w:val="false"/>
+                <w:u w:val="none"/>
+                <w:strike w:val="false"/>
+                <w:sz w:val="16"/>
+                <w:szCs w:val="16"/>
+                <w:color w:val="000000"/>
+              </w:rPr>
             </w:pPr>
             <w:r>
               <w:rPr>
@@ -1059,6 +1305,7 @@
                 <w:i w:val="false"/>
                 <w:b w:val="false"/>
                 <w:u w:val="none"/>
+                <w:strike w:val="false"/>
                 <w:sz w:val="16"/>
                 <w:szCs w:val="16"/>
                 <w:color w:val="000000"/>
@@ -1096,6 +1343,16 @@
               </w:pBdr>
               <w:spacing w:after="0" w:before="0" w:line="240"/>
               <w:ind w:left="100" w:right="100" w:firstLine="0" w:firstLineChars="0"/>
+              <w:rPr>
+                <w:rFonts w:ascii="Arial" w:hAnsi="Arial" w:eastAsia="Arial" w:cs="Arial"/>
+                <w:i w:val="false"/>
+                <w:b w:val="false"/>
+                <w:u w:val="none"/>
+                <w:strike w:val="false"/>
+                <w:sz w:val="16"/>
+                <w:szCs w:val="16"/>
+                <w:color w:val="000000"/>
+              </w:rPr>
             </w:pPr>
             <w:r>
               <w:rPr>
@@ -1103,6 +1360,7 @@
                 <w:i w:val="false"/>
                 <w:b w:val="false"/>
                 <w:u w:val="none"/>
+                <w:strike w:val="false"/>
                 <w:sz w:val="16"/>
                 <w:szCs w:val="16"/>
                 <w:color w:val="000000"/>
@@ -1140,6 +1398,16 @@
               </w:pBdr>
               <w:spacing w:after="0" w:before="0" w:line="240"/>
               <w:ind w:left="100" w:right="100" w:firstLine="0" w:firstLineChars="0"/>
+              <w:rPr>
+                <w:rFonts w:ascii="Arial" w:hAnsi="Arial" w:eastAsia="Arial" w:cs="Arial"/>
+                <w:i w:val="false"/>
+                <w:b w:val="false"/>
+                <w:u w:val="none"/>
+                <w:strike w:val="false"/>
+                <w:sz w:val="16"/>
+                <w:szCs w:val="16"/>
+                <w:color w:val="000000"/>
+              </w:rPr>
             </w:pPr>
             <w:r>
               <w:rPr>
@@ -1147,6 +1415,7 @@
                 <w:i w:val="false"/>
                 <w:b w:val="false"/>
                 <w:u w:val="none"/>
+                <w:strike w:val="false"/>
                 <w:sz w:val="16"/>
                 <w:szCs w:val="16"/>
                 <w:color w:val="000000"/>
@@ -1184,6 +1453,16 @@
               </w:pBdr>
               <w:spacing w:after="0" w:before="0" w:line="240"/>
               <w:ind w:left="100" w:right="100" w:firstLine="0" w:firstLineChars="0"/>
+              <w:rPr>
+                <w:rFonts w:ascii="Arial" w:hAnsi="Arial" w:eastAsia="Arial" w:cs="Arial"/>
+                <w:i w:val="false"/>
+                <w:b w:val="false"/>
+                <w:u w:val="none"/>
+                <w:strike w:val="false"/>
+                <w:sz w:val="16"/>
+                <w:szCs w:val="16"/>
+                <w:color w:val="000000"/>
+              </w:rPr>
             </w:pPr>
             <w:r>
               <w:rPr>
@@ -1191,6 +1470,7 @@
                 <w:i w:val="false"/>
                 <w:b w:val="false"/>
                 <w:u w:val="none"/>
+                <w:strike w:val="false"/>
                 <w:sz w:val="16"/>
                 <w:szCs w:val="16"/>
                 <w:color w:val="000000"/>
@@ -1228,6 +1508,16 @@
               </w:pBdr>
               <w:spacing w:after="0" w:before="0" w:line="240"/>
               <w:ind w:left="100" w:right="100" w:firstLine="0" w:firstLineChars="0"/>
+              <w:rPr>
+                <w:rFonts w:ascii="Arial" w:hAnsi="Arial" w:eastAsia="Arial" w:cs="Arial"/>
+                <w:i w:val="false"/>
+                <w:b w:val="false"/>
+                <w:u w:val="none"/>
+                <w:strike w:val="false"/>
+                <w:sz w:val="16"/>
+                <w:szCs w:val="16"/>
+                <w:color w:val="000000"/>
+              </w:rPr>
             </w:pPr>
             <w:r>
               <w:rPr>
@@ -1235,6 +1525,7 @@
                 <w:i w:val="false"/>
                 <w:b w:val="false"/>
                 <w:u w:val="none"/>
+                <w:strike w:val="false"/>
                 <w:sz w:val="16"/>
                 <w:szCs w:val="16"/>
                 <w:color w:val="000000"/>
@@ -1248,7 +1539,6 @@
         <w:trPr>
           <w:trHeight w:val="617" w:hRule="auto"/>
         </w:trPr>
-        body5
         <w:tc>
           <w:tcPr>
             <w:tcBorders>
@@ -1278,6 +1568,16 @@
               </w:pBdr>
               <w:spacing w:after="0" w:before="0" w:line="240"/>
               <w:ind w:left="100" w:right="100" w:firstLine="0" w:firstLineChars="0"/>
+              <w:rPr>
+                <w:rFonts w:ascii="Arial" w:hAnsi="Arial" w:eastAsia="Arial" w:cs="Arial"/>
+                <w:i w:val="false"/>
+                <w:b w:val="true"/>
+                <w:u w:val="none"/>
+                <w:strike w:val="false"/>
+                <w:sz w:val="16"/>
+                <w:szCs w:val="16"/>
+                <w:color w:val="000000"/>
+              </w:rPr>
             </w:pPr>
             <w:r>
               <w:rPr>
@@ -1285,6 +1585,7 @@
                 <w:i w:val="false"/>
                 <w:b w:val="true"/>
                 <w:u w:val="none"/>
+                <w:strike w:val="false"/>
                 <w:sz w:val="16"/>
                 <w:szCs w:val="16"/>
                 <w:color w:val="000000"/>
@@ -1322,6 +1623,16 @@
               </w:pBdr>
               <w:spacing w:after="0" w:before="0" w:line="240"/>
               <w:ind w:left="100" w:right="100" w:firstLine="0" w:firstLineChars="0"/>
+              <w:rPr>
+                <w:rFonts w:ascii="Arial" w:hAnsi="Arial" w:eastAsia="Arial" w:cs="Arial"/>
+                <w:i w:val="false"/>
+                <w:b w:val="false"/>
+                <w:u w:val="none"/>
+                <w:strike w:val="false"/>
+                <w:sz w:val="16"/>
+                <w:szCs w:val="16"/>
+                <w:color w:val="000000"/>
+              </w:rPr>
             </w:pPr>
             <w:r>
               <w:rPr>
@@ -1329,6 +1640,7 @@
                 <w:i w:val="false"/>
                 <w:b w:val="false"/>
                 <w:u w:val="none"/>
+                <w:strike w:val="false"/>
                 <w:sz w:val="16"/>
                 <w:szCs w:val="16"/>
                 <w:color w:val="000000"/>
@@ -1366,6 +1678,16 @@
               </w:pBdr>
               <w:spacing w:after="0" w:before="0" w:line="240"/>
               <w:ind w:left="100" w:right="100" w:firstLine="0" w:firstLineChars="0"/>
+              <w:rPr>
+                <w:rFonts w:ascii="Arial" w:hAnsi="Arial" w:eastAsia="Arial" w:cs="Arial"/>
+                <w:i w:val="false"/>
+                <w:b w:val="false"/>
+                <w:u w:val="none"/>
+                <w:strike w:val="false"/>
+                <w:sz w:val="16"/>
+                <w:szCs w:val="16"/>
+                <w:color w:val="000000"/>
+              </w:rPr>
             </w:pPr>
             <w:r>
               <w:rPr>
@@ -1373,6 +1695,7 @@
                 <w:i w:val="false"/>
                 <w:b w:val="false"/>
                 <w:u w:val="none"/>
+                <w:strike w:val="false"/>
                 <w:sz w:val="16"/>
                 <w:szCs w:val="16"/>
                 <w:color w:val="000000"/>
@@ -1410,6 +1733,16 @@
               </w:pBdr>
               <w:spacing w:after="0" w:before="0" w:line="240"/>
               <w:ind w:left="100" w:right="100" w:firstLine="0" w:firstLineChars="0"/>
+              <w:rPr>
+                <w:rFonts w:ascii="Arial" w:hAnsi="Arial" w:eastAsia="Arial" w:cs="Arial"/>
+                <w:i w:val="false"/>
+                <w:b w:val="false"/>
+                <w:u w:val="none"/>
+                <w:strike w:val="false"/>
+                <w:sz w:val="16"/>
+                <w:szCs w:val="16"/>
+                <w:color w:val="000000"/>
+              </w:rPr>
             </w:pPr>
             <w:r>
               <w:rPr>
@@ -1417,6 +1750,7 @@
                 <w:i w:val="false"/>
                 <w:b w:val="false"/>
                 <w:u w:val="none"/>
+                <w:strike w:val="false"/>
                 <w:sz w:val="16"/>
                 <w:szCs w:val="16"/>
                 <w:color w:val="000000"/>
@@ -1454,6 +1788,16 @@
               </w:pBdr>
               <w:spacing w:after="0" w:before="0" w:line="240"/>
               <w:ind w:left="100" w:right="100" w:firstLine="0" w:firstLineChars="0"/>
+              <w:rPr>
+                <w:rFonts w:ascii="Arial" w:hAnsi="Arial" w:eastAsia="Arial" w:cs="Arial"/>
+                <w:i w:val="false"/>
+                <w:b w:val="false"/>
+                <w:u w:val="none"/>
+                <w:strike w:val="false"/>
+                <w:sz w:val="16"/>
+                <w:szCs w:val="16"/>
+                <w:color w:val="000000"/>
+              </w:rPr>
             </w:pPr>
             <w:r>
               <w:rPr>
@@ -1461,6 +1805,7 @@
                 <w:i w:val="false"/>
                 <w:b w:val="false"/>
                 <w:u w:val="none"/>
+                <w:strike w:val="false"/>
                 <w:sz w:val="16"/>
                 <w:szCs w:val="16"/>
                 <w:color w:val="000000"/>
@@ -1471,9 +1816,9 @@
         </w:tc>
       </w:tr>
     </w:tbl>
-    <w:sectPr w:officer="true">
-      <w:pgMar w:header="720" w:bottom="1440" w:top="1440" w:right="1440" w:left="1440" w:footer="720" w:gutter="720"/>
-      <w:pgSz w:h="16848" w:w="11952" w:orient="portrait"/>
+    <w:sectPr>
+      <w:pgMar w:header="708" w:bottom="1417" w:top="1417" w:right="1417" w:left="1417" w:footer="708" w:gutter="0"/>
+      <w:pgSz w:h="16838" w:w="11906" w:orient="portrait"/>
       <w:type w:val="continuous"/>
       <w:cols/>
     </w:sectPr>

</xml_diff>

<commit_message>
Minor changes and additional sensitivity analyses
</commit_message>
<xml_diff>
--- a/detection_mode_project/outputs/figures/supplement/supplementary_table_1.docx
+++ b/detection_mode_project/outputs/figures/supplement/supplementary_table_1.docx
@@ -525,7 +525,7 @@
                 <w:szCs w:val="16"/>
                 <w:color w:val="000000"/>
               </w:rPr>
-              <w:t xml:space="preserve">477 </w:t>
+              <w:t xml:space="preserve">501 </w:t>
             </w:r>
           </w:p>
         </w:tc>
@@ -635,7 +635,7 @@
                 <w:szCs w:val="16"/>
                 <w:color w:val="000000"/>
               </w:rPr>
-              <w:t xml:space="preserve">150 </w:t>
+              <w:t xml:space="preserve">397 </w:t>
             </w:r>
           </w:p>
         </w:tc>
@@ -690,7 +690,7 @@
                 <w:szCs w:val="16"/>
                 <w:color w:val="000000"/>
               </w:rPr>
-              <w:t xml:space="preserve">627 (24%)</w:t>
+              <w:t xml:space="preserve">898 (34%)</w:t>
             </w:r>
           </w:p>
         </w:tc>
@@ -805,7 +805,7 @@
                 <w:szCs w:val="16"/>
                 <w:color w:val="000000"/>
               </w:rPr>
-              <w:t xml:space="preserve">32 </w:t>
+              <w:t xml:space="preserve">33 </w:t>
             </w:r>
           </w:p>
         </w:tc>
@@ -860,7 +860,7 @@
                 <w:szCs w:val="16"/>
                 <w:color w:val="000000"/>
               </w:rPr>
-              <w:t xml:space="preserve">827 </w:t>
+              <w:t xml:space="preserve">852 </w:t>
             </w:r>
           </w:p>
         </w:tc>
@@ -915,7 +915,7 @@
                 <w:szCs w:val="16"/>
                 <w:color w:val="000000"/>
               </w:rPr>
-              <w:t xml:space="preserve">237 </w:t>
+              <w:t xml:space="preserve">119 </w:t>
             </w:r>
           </w:p>
         </w:tc>
@@ -970,7 +970,7 @@
                 <w:szCs w:val="16"/>
                 <w:color w:val="000000"/>
               </w:rPr>
-              <w:t xml:space="preserve">1,096 (42%)</w:t>
+              <w:t xml:space="preserve">1,004 (38%)</w:t>
             </w:r>
           </w:p>
         </w:tc>
@@ -1030,7 +1030,7 @@
                 <w:szCs w:val="16"/>
                 <w:color w:val="000000"/>
               </w:rPr>
-              <w:t xml:space="preserve">Other</w:t>
+              <w:t xml:space="preserve">Unknown</w:t>
             </w:r>
           </w:p>
         </w:tc>
@@ -1085,7 +1085,7 @@
                 <w:szCs w:val="16"/>
                 <w:color w:val="000000"/>
               </w:rPr>
-              <w:t xml:space="preserve">31 </w:t>
+              <w:t xml:space="preserve">17 </w:t>
             </w:r>
           </w:p>
         </w:tc>
@@ -1195,7 +1195,7 @@
                 <w:szCs w:val="16"/>
                 <w:color w:val="000000"/>
               </w:rPr>
-              <w:t xml:space="preserve">459 </w:t>
+              <w:t xml:space="preserve">56 </w:t>
             </w:r>
           </w:p>
         </w:tc>
@@ -1250,7 +1250,7 @@
                 <w:szCs w:val="16"/>
                 <w:color w:val="000000"/>
               </w:rPr>
-              <w:t xml:space="preserve">496 (19%)</w:t>
+              <w:t xml:space="preserve">79 (3.0%)</w:t>
             </w:r>
           </w:p>
         </w:tc>
@@ -1365,7 +1365,7 @@
                 <w:szCs w:val="16"/>
                 <w:color w:val="000000"/>
               </w:rPr>
-              <w:t xml:space="preserve">73 </w:t>
+              <w:t xml:space="preserve">62 </w:t>
             </w:r>
           </w:p>
         </w:tc>
@@ -1420,7 +1420,7 @@
                 <w:szCs w:val="16"/>
                 <w:color w:val="000000"/>
               </w:rPr>
-              <w:t xml:space="preserve">75 </w:t>
+              <w:t xml:space="preserve">50 </w:t>
             </w:r>
           </w:p>
         </w:tc>
@@ -1475,7 +1475,7 @@
                 <w:szCs w:val="16"/>
                 <w:color w:val="000000"/>
               </w:rPr>
-              <w:t xml:space="preserve">248 </w:t>
+              <w:t xml:space="preserve">522 </w:t>
             </w:r>
           </w:p>
         </w:tc>
@@ -1530,7 +1530,7 @@
                 <w:szCs w:val="16"/>
                 <w:color w:val="000000"/>
               </w:rPr>
-              <w:t xml:space="preserve">396 (15%)</w:t>
+              <w:t xml:space="preserve">634 (24%)</w:t>
             </w:r>
           </w:p>
         </w:tc>

</xml_diff>